<commit_message>
feat:added frontend and intalled required package (swagger, postgresh sql and enity framework
</commit_message>
<xml_diff>
--- a/(s395172) Dharma_Bahadur_Budhathoki/week2/auraEarn-project_proposal.docx
+++ b/(s395172) Dharma_Bahadur_Budhathoki/week2/auraEarn-project_proposal.docx
@@ -6,12 +6,20 @@
       <w:pPr>
         <w:rPr>
           <w:rFonts w:ascii="Times New Roman" w:hAnsi="Times New Roman" w:cs="Times New Roman"/>
+          <w:b/>
+          <w:bCs/>
+          <w:sz w:val="36"/>
+          <w:szCs w:val="36"/>
         </w:rPr>
       </w:pPr>
       <w:proofErr w:type="spellStart"/>
       <w:r>
         <w:rPr>
           <w:rFonts w:ascii="Times New Roman" w:hAnsi="Times New Roman" w:cs="Times New Roman"/>
+          <w:b/>
+          <w:bCs/>
+          <w:sz w:val="36"/>
+          <w:szCs w:val="36"/>
         </w:rPr>
         <w:t>OraEarn</w:t>
       </w:r>
@@ -19,6 +27,10 @@
       <w:r>
         <w:rPr>
           <w:rFonts w:ascii="Times New Roman" w:hAnsi="Times New Roman" w:cs="Times New Roman"/>
+          <w:b/>
+          <w:bCs/>
+          <w:sz w:val="36"/>
+          <w:szCs w:val="36"/>
         </w:rPr>
         <w:t xml:space="preserve"> — Project Proposal</w:t>
       </w:r>

</xml_diff>